<commit_message>
Modularize pipeline, add tests, EDA notebook and interview prep doc
- Package each stage (preprocessing, database, sql, models, drift, dashboard)
- Time-based 80/20 train/held-out split with generalization check
- Drift monitoring updates (PSI, KS, dual retraining trigger)
- Add pytest suite (35 tests) and eda/eda.ipynb
- Add docs/interview-prep.md for both contributors
- Stop tracking database/database.db (1.2 GB, already covered by .gitignore)

Co-Authored-By: Claude Opus 5.5 <noreply@anthropic.com>
</commit_message>
<xml_diff>
--- a/docs/Project_Overview.docx
+++ b/docs/Project_Overview.docx
@@ -835,7 +835,7 @@
           </w:tcPr>
           <w:p>
             <w:r>
-              <w:t>Fits sklearn IsolationForest, persists model + scaler via joblib.</w:t>
+              <w:t>Fits sklearn IsolationForest on the earliest 80% of rows by step (time-based split), persists model + scaler via joblib.</w:t>
             </w:r>
           </w:p>
         </w:tc>
@@ -899,7 +899,7 @@
           </w:tcPr>
           <w:p>
             <w:r>
-              <w:t>PR-AUC, ROC-AUC, precision@k/recall@k, confusion matrix by type.</w:t>
+              <w:t>PR-AUC, ROC-AUC, precision@k/recall@k, confusion matrix by type on held-out rows; train-vs-held-out overfitting check.</w:t>
             </w:r>
           </w:p>
         </w:tc>
@@ -997,7 +997,7 @@
           </w:tcPr>
           <w:p>
             <w:r>
-              <w:t>24 pytest cases covering cleaning, feature engineering, drift.</w:t>
+              <w:t>35 pytest cases covering cleaning, feature engineering, drift, and the train/test split.</w:t>
             </w:r>
           </w:p>
         </w:tc>
@@ -1351,7 +1351,7 @@
         <w:rPr>
           <w:color w:val="1B2A4A"/>
         </w:rPr>
-        <w:t>6. Measured Results (Full 6,362,604-Row Run)</w:t>
+        <w:t>6. Measured Results (Full 6,362,604-Row Dataset)</w:t>
       </w:r>
     </w:p>
     <w:p>
@@ -1362,6 +1362,222 @@
           <w:sz w:val="22"/>
         </w:rPr>
         <w:t>Every figure below is from an actual run against the complete dataset, recorded in docs/05 through docs/08 alongside full command output.</w:t>
+      </w:r>
+    </w:p>
+    <w:p>
+      <w:r>
+        <w:rPr>
+          <w:b/>
+          <w:i w:val="0"/>
+          <w:sz w:val="22"/>
+        </w:rPr>
+        <w:t>Train/test split:</w:t>
+      </w:r>
+    </w:p>
+    <w:tbl>
+      <w:tblPr>
+        <w:tblStyle w:val="LightGrid-Accent1"/>
+        <w:tblW w:type="auto" w:w="0"/>
+        <w:tblLook w:firstColumn="1" w:firstRow="1" w:lastColumn="0" w:lastRow="0" w:noHBand="0" w:noVBand="1" w:val="04A0"/>
+      </w:tblPr>
+      <w:tblGrid>
+        <w:gridCol w:w="1728"/>
+        <w:gridCol w:w="1728"/>
+        <w:gridCol w:w="1728"/>
+        <w:gridCol w:w="1728"/>
+        <w:gridCol w:w="1728"/>
+      </w:tblGrid>
+      <w:tr>
+        <w:tc>
+          <w:tcPr>
+            <w:tcW w:type="dxa" w:w="1728"/>
+          </w:tcPr>
+          <w:p>
+            <w:r>
+              <w:rPr>
+                <w:b/>
+              </w:rPr>
+              <w:t>Partition</w:t>
+            </w:r>
+          </w:p>
+        </w:tc>
+        <w:tc>
+          <w:tcPr>
+            <w:tcW w:type="dxa" w:w="1728"/>
+          </w:tcPr>
+          <w:p>
+            <w:r>
+              <w:rPr>
+                <w:b/>
+              </w:rPr>
+              <w:t>Steps</w:t>
+            </w:r>
+          </w:p>
+        </w:tc>
+        <w:tc>
+          <w:tcPr>
+            <w:tcW w:type="dxa" w:w="1728"/>
+          </w:tcPr>
+          <w:p>
+            <w:r>
+              <w:rPr>
+                <w:b/>
+              </w:rPr>
+              <w:t>Rows</w:t>
+            </w:r>
+          </w:p>
+        </w:tc>
+        <w:tc>
+          <w:tcPr>
+            <w:tcW w:type="dxa" w:w="1728"/>
+          </w:tcPr>
+          <w:p>
+            <w:r>
+              <w:rPr>
+                <w:b/>
+              </w:rPr>
+              <w:t>Fraud</w:t>
+            </w:r>
+          </w:p>
+        </w:tc>
+        <w:tc>
+          <w:tcPr>
+            <w:tcW w:type="dxa" w:w="1728"/>
+          </w:tcPr>
+          <w:p>
+            <w:r>
+              <w:rPr>
+                <w:b/>
+              </w:rPr>
+              <w:t>Base fraud rate</w:t>
+            </w:r>
+          </w:p>
+        </w:tc>
+      </w:tr>
+      <w:tr>
+        <w:tc>
+          <w:tcPr>
+            <w:tcW w:type="dxa" w:w="1728"/>
+          </w:tcPr>
+          <w:p>
+            <w:r>
+              <w:t>Training</w:t>
+            </w:r>
+          </w:p>
+        </w:tc>
+        <w:tc>
+          <w:tcPr>
+            <w:tcW w:type="dxa" w:w="1728"/>
+          </w:tcPr>
+          <w:p>
+            <w:r>
+              <w:t>1-355</w:t>
+            </w:r>
+          </w:p>
+        </w:tc>
+        <w:tc>
+          <w:tcPr>
+            <w:tcW w:type="dxa" w:w="1728"/>
+          </w:tcPr>
+          <w:p>
+            <w:r>
+              <w:t>5,113,881</w:t>
+            </w:r>
+          </w:p>
+        </w:tc>
+        <w:tc>
+          <w:tcPr>
+            <w:tcW w:type="dxa" w:w="1728"/>
+          </w:tcPr>
+          <w:p>
+            <w:r>
+              <w:t>3,960</w:t>
+            </w:r>
+          </w:p>
+        </w:tc>
+        <w:tc>
+          <w:tcPr>
+            <w:tcW w:type="dxa" w:w="1728"/>
+          </w:tcPr>
+          <w:p>
+            <w:r>
+              <w:t>0.077%</w:t>
+            </w:r>
+          </w:p>
+        </w:tc>
+      </w:tr>
+      <w:tr>
+        <w:tc>
+          <w:tcPr>
+            <w:tcW w:type="dxa" w:w="1728"/>
+          </w:tcPr>
+          <w:p>
+            <w:r>
+              <w:t>Held-out</w:t>
+            </w:r>
+          </w:p>
+        </w:tc>
+        <w:tc>
+          <w:tcPr>
+            <w:tcW w:type="dxa" w:w="1728"/>
+          </w:tcPr>
+          <w:p>
+            <w:r>
+              <w:t>356-743</w:t>
+            </w:r>
+          </w:p>
+        </w:tc>
+        <w:tc>
+          <w:tcPr>
+            <w:tcW w:type="dxa" w:w="1728"/>
+          </w:tcPr>
+          <w:p>
+            <w:r>
+              <w:t>1,248,723</w:t>
+            </w:r>
+          </w:p>
+        </w:tc>
+        <w:tc>
+          <w:tcPr>
+            <w:tcW w:type="dxa" w:w="1728"/>
+          </w:tcPr>
+          <w:p>
+            <w:r>
+              <w:t>4,237</w:t>
+            </w:r>
+          </w:p>
+        </w:tc>
+        <w:tc>
+          <w:tcPr>
+            <w:tcW w:type="dxa" w:w="1728"/>
+          </w:tcPr>
+          <w:p>
+            <w:r>
+              <w:t>0.339%</w:t>
+            </w:r>
+          </w:p>
+        </w:tc>
+      </w:tr>
+    </w:tbl>
+    <w:p/>
+    <w:p>
+      <w:r>
+        <w:rPr>
+          <w:b w:val="0"/>
+          <w:i w:val="0"/>
+          <w:sz w:val="22"/>
+        </w:rPr>
+        <w:t>The model is fit only on the earliest 80% of rows by step. Later rows never touch the scaler, the model or the drift reference window, so evaluation measures performance on transactions from after the training period. The split is by time, not at random, because a deployed model only ever scores later transactions.</w:t>
+      </w:r>
+    </w:p>
+    <w:p>
+      <w:r>
+        <w:rPr>
+          <w:b/>
+          <w:i w:val="0"/>
+          <w:sz w:val="22"/>
+        </w:rPr>
+        <w:t>Pipeline stages:</w:t>
       </w:r>
     </w:p>
     <w:tbl>
@@ -1443,7 +1659,7 @@
           </w:tcPr>
           <w:p>
             <w:r>
-              <w:t>4m 25s</w:t>
+              <w:t>4m 19s - 4m 25s</w:t>
             </w:r>
           </w:p>
         </w:tc>
@@ -1455,7 +1671,7 @@
           </w:tcPr>
           <w:p>
             <w:r>
-              <w:t>Model training</w:t>
+              <w:t>Model training (run 2)</w:t>
             </w:r>
           </w:p>
         </w:tc>
@@ -1465,7 +1681,7 @@
           </w:tcPr>
           <w:p>
             <w:r>
-              <w:t>run_id = 1, 200 estimators</w:t>
+              <w:t>5,113,881 training rows, 200 estimators</w:t>
             </w:r>
           </w:p>
         </w:tc>
@@ -1475,7 +1691,7 @@
           </w:tcPr>
           <w:p>
             <w:r>
-              <w:t>2m 58s</w:t>
+              <w:t>Not separately timed</w:t>
             </w:r>
           </w:p>
         </w:tc>
@@ -1487,7 +1703,7 @@
           </w:tcPr>
           <w:p>
             <w:r>
-              <w:t>Evaluation</w:t>
+              <w:t>Evaluation (run 2)</w:t>
             </w:r>
           </w:p>
         </w:tc>
@@ -1497,7 +1713,7 @@
           </w:tcPr>
           <w:p>
             <w:r>
-              <w:t>PR-AUC 0.0114, ROC-AUC 0.8540</w:t>
+              <w:t>Held-out PR-AUC 0.0280, ROC-AUC 0.8538</w:t>
             </w:r>
           </w:p>
         </w:tc>
@@ -1507,7 +1723,7 @@
           </w:tcPr>
           <w:p>
             <w:r>
-              <w:t>6m 9s</w:t>
+              <w:t>Not separately timed</w:t>
             </w:r>
           </w:p>
         </w:tc>
@@ -1519,7 +1735,7 @@
           </w:tcPr>
           <w:p>
             <w:r>
-              <w:t>Anomaly scoring</w:t>
+              <w:t>Anomaly scoring (run 1 model)</w:t>
             </w:r>
           </w:p>
         </w:tc>
@@ -1551,7 +1767,7 @@
           </w:tcPr>
           <w:p>
             <w:r>
-              <w:t>Drift check</w:t>
+              <w:t>Drift check (run 2)</w:t>
             </w:r>
           </w:p>
         </w:tc>
@@ -1571,7 +1787,199 @@
           </w:tcPr>
           <w:p>
             <w:r>
-              <w:t>8.6s</w:t>
+              <w:t>25.1s</w:t>
+            </w:r>
+          </w:p>
+        </w:tc>
+      </w:tr>
+    </w:tbl>
+    <w:p/>
+    <w:p>
+      <w:r>
+        <w:rPr>
+          <w:b/>
+          <w:i w:val="0"/>
+          <w:sz w:val="22"/>
+        </w:rPr>
+        <w:t>Overfitting check (training window vs held-out window):</w:t>
+      </w:r>
+    </w:p>
+    <w:tbl>
+      <w:tblPr>
+        <w:tblStyle w:val="LightGrid-Accent1"/>
+        <w:tblW w:type="auto" w:w="0"/>
+        <w:tblLook w:firstColumn="1" w:firstRow="1" w:lastColumn="0" w:lastRow="0" w:noHBand="0" w:noVBand="1" w:val="04A0"/>
+      </w:tblPr>
+      <w:tblGrid>
+        <w:gridCol w:w="2880"/>
+        <w:gridCol w:w="2880"/>
+        <w:gridCol w:w="2880"/>
+      </w:tblGrid>
+      <w:tr>
+        <w:tc>
+          <w:tcPr>
+            <w:tcW w:type="dxa" w:w="2880"/>
+          </w:tcPr>
+          <w:p>
+            <w:r>
+              <w:rPr>
+                <w:b/>
+              </w:rPr>
+              <w:t>Metric</w:t>
+            </w:r>
+          </w:p>
+        </w:tc>
+        <w:tc>
+          <w:tcPr>
+            <w:tcW w:type="dxa" w:w="2880"/>
+          </w:tcPr>
+          <w:p>
+            <w:r>
+              <w:rPr>
+                <w:b/>
+              </w:rPr>
+              <w:t>Training (steps 1-355)</w:t>
+            </w:r>
+          </w:p>
+        </w:tc>
+        <w:tc>
+          <w:tcPr>
+            <w:tcW w:type="dxa" w:w="2880"/>
+          </w:tcPr>
+          <w:p>
+            <w:r>
+              <w:rPr>
+                <w:b/>
+              </w:rPr>
+              <w:t>Held-out (steps 356-743)</w:t>
+            </w:r>
+          </w:p>
+        </w:tc>
+      </w:tr>
+      <w:tr>
+        <w:tc>
+          <w:tcPr>
+            <w:tcW w:type="dxa" w:w="2880"/>
+          </w:tcPr>
+          <w:p>
+            <w:r>
+              <w:t>ROC-AUC</w:t>
+            </w:r>
+          </w:p>
+        </w:tc>
+        <w:tc>
+          <w:tcPr>
+            <w:tcW w:type="dxa" w:w="2880"/>
+          </w:tcPr>
+          <w:p>
+            <w:r>
+              <w:t>0.8508</w:t>
+            </w:r>
+          </w:p>
+        </w:tc>
+        <w:tc>
+          <w:tcPr>
+            <w:tcW w:type="dxa" w:w="2880"/>
+          </w:tcPr>
+          <w:p>
+            <w:r>
+              <w:t>0.8538 (gap -0.003)</w:t>
+            </w:r>
+          </w:p>
+        </w:tc>
+      </w:tr>
+      <w:tr>
+        <w:tc>
+          <w:tcPr>
+            <w:tcW w:type="dxa" w:w="2880"/>
+          </w:tcPr>
+          <w:p>
+            <w:r>
+              <w:t>PR-AUC</w:t>
+            </w:r>
+          </w:p>
+        </w:tc>
+        <w:tc>
+          <w:tcPr>
+            <w:tcW w:type="dxa" w:w="2880"/>
+          </w:tcPr>
+          <w:p>
+            <w:r>
+              <w:t>0.0063</w:t>
+            </w:r>
+          </w:p>
+        </w:tc>
+        <w:tc>
+          <w:tcPr>
+            <w:tcW w:type="dxa" w:w="2880"/>
+          </w:tcPr>
+          <w:p>
+            <w:r>
+              <w:t>0.0280</w:t>
+            </w:r>
+          </w:p>
+        </w:tc>
+      </w:tr>
+      <w:tr>
+        <w:tc>
+          <w:tcPr>
+            <w:tcW w:type="dxa" w:w="2880"/>
+          </w:tcPr>
+          <w:p>
+            <w:r>
+              <w:t>PR-AUC lift over base rate</w:t>
+            </w:r>
+          </w:p>
+        </w:tc>
+        <w:tc>
+          <w:tcPr>
+            <w:tcW w:type="dxa" w:w="2880"/>
+          </w:tcPr>
+          <w:p>
+            <w:r>
+              <w:t>8.18x</w:t>
+            </w:r>
+          </w:p>
+        </w:tc>
+        <w:tc>
+          <w:tcPr>
+            <w:tcW w:type="dxa" w:w="2880"/>
+          </w:tcPr>
+          <w:p>
+            <w:r>
+              <w:t>8.24x</w:t>
+            </w:r>
+          </w:p>
+        </w:tc>
+      </w:tr>
+      <w:tr>
+        <w:tc>
+          <w:tcPr>
+            <w:tcW w:type="dxa" w:w="2880"/>
+          </w:tcPr>
+          <w:p>
+            <w:r>
+              <w:t>Precision@0.5% / Recall@0.5%</w:t>
+            </w:r>
+          </w:p>
+        </w:tc>
+        <w:tc>
+          <w:tcPr>
+            <w:tcW w:type="dxa" w:w="2880"/>
+          </w:tcPr>
+          <w:p>
+            <w:r>
+              <w:t>-</w:t>
+            </w:r>
+          </w:p>
+        </w:tc>
+        <w:tc>
+          <w:tcPr>
+            <w:tcW w:type="dxa" w:w="2880"/>
+          </w:tcPr>
+          <w:p>
+            <w:r>
+              <w:t>0.0394 / 0.0581</w:t>
             </w:r>
           </w:p>
         </w:tc>
@@ -1585,7 +1993,17 @@
           <w:i w:val="0"/>
           <w:sz w:val="22"/>
         </w:rPr>
-        <w:t>A PR-AUC of 0.0114 against a 0.129% base fraud rate represents roughly an 8.8x enrichment over random guessing in the model's highest-scored transactions -- the absolute value looks small in isolation but is the expected order of magnitude under this severity of class imbalance. ROC-AUC of 0.854 confirms solid overall rank-ordering. The confusion matrix by type concentrates almost all errors in TRANSFER (26,793 false positives, 814 true positives) and CASH_OUT (291 false positives, 3 true positives) -- exactly the two types where PaySim fraud actually occurs, rather than spreading across CASH_IN / DEBIT / PAYMENT, which would have signaled a mis-specified feature.</w:t>
+        <w:t>The model does not overfit: held-out ROC-AUC matches the training window, and lift is almost identical. Raw PR-AUC is higher on the held-out rows only because their fraud rate is about 4.4x higher (PaySim's transaction volume collapses in the late steps while fraud keeps arriving), so evaluate.py flags overfitting on the ROC-AUC gap (above 0.05), which does not depend on the base rate.</w:t>
+      </w:r>
+    </w:p>
+    <w:p>
+      <w:r>
+        <w:rPr>
+          <w:b w:val="0"/>
+          <w:i w:val="0"/>
+          <w:sz w:val="22"/>
+        </w:rPr>
+        <w:t>The real limitation is missing signal, not memorization. All 246 frauds caught in the held-out window are TRANSFERs; none of the 2,112 CASH_OUT frauds are flagged at the top-0.5% threshold. Errors still concentrate in TRANSFER and CASH_OUT, the two types where PaySim fraud occurs, rather than spreading across CASH_IN / DEBIT / PAYMENT, which would have signaled a mis-specified feature.</w:t>
       </w:r>
     </w:p>
     <w:p>
@@ -1595,7 +2013,7 @@
           <w:i/>
           <w:sz w:val="20"/>
         </w:rPr>
-        <w:t>Note: this evaluation run scored the model against the same full dataset it was trained on (no held-out nameOrig or step-range split), consistent with using isFraud only for offline evaluation rather than for train/test partitioning of an unsupervised model. These numbers describe in-sample discriminative power; a rigorous production benchmark would score a genuinely unseen window instead.</w:t>
+        <w:t>Note: run 1 (trained and evaluated on all 6,362,604 rows before the split existed) scored PR-AUC 0.0114 and ROC-AUC 0.8540. Those numbers are in-sample; its ROC-AUC matches run 2's held-out ROC-AUC, confirming they were not inflated, but its PR-AUC is not comparable with run 2's because the fraud rate differs.</w:t>
       </w:r>
     </w:p>
     <w:p>
@@ -1837,7 +2255,7 @@
           <w:i w:val="0"/>
           <w:sz w:val="22"/>
         </w:rPr>
-        <w:t>The Kolmogorov-Smirnov test complements PSI by testing the maximum distance between empirical CDFs and returning a p-value rather than a fixed-bucket approximation. Retraining triggers automatically when three or more features simultaneously exceed PSI 0.25, or PR-AUC on the rolling evaluation window drops more than 15% relative to the last deployed model. On the measured run (reference window vs. step 600-744), all 12 features showed zero significant PSI drift, so no retrain fired -- expected, since both windows are drawn from the same underlying training-set population. KS flagged several features as statistically significant despite near-zero PSI, which is not a contradiction: KS is far more sensitive at multi-million-row sample sizes and will flag negligible practical shifts as significant, which is exactly why the retraining trigger is keyed on PSI's banded severity rather than the KS p-value alone.</w:t>
+        <w:t>The Kolmogorov-Smirnov test complements PSI by testing the maximum distance between empirical CDFs and returning a p-value rather than a fixed-bucket approximation. Retraining triggers automatically when three or more features simultaneously exceed PSI 0.25, or PR-AUC drops more than 15% relative to the last deployed model (as implemented, the PR-AUC half compares the latest run with itself and never fires; see docs/08). On the measured run (run 2's reference window, sampled from training steps 1-355, vs. held-out steps 600-744), all 12 features showed zero significant PSI drift, so no retrain fired: PaySim's late-step feature distributions stay close to the early ones, consistent with the unchanged held-out ROC-AUC. KS flagged several features as statistically significant despite near-zero PSI, which is not a contradiction: KS is far more sensitive at multi-million-row sample sizes and will flag negligible practical shifts as significant, which is exactly why the retraining trigger is keyed on PSI's banded severity rather than the KS p-value alone.</w:t>
       </w:r>
     </w:p>
     <w:p>
@@ -1972,7 +2390,7 @@
           </w:tcPr>
           <w:p>
             <w:r>
-              <w:t>PR-AUC / ROC-AUC trend across model_runs versions; confusion matrix.</w:t>
+              <w:t>PR-AUC / ROC-AUC trend across model_runs versions; confusion matrix. Run 1's points are in-sample, later runs are held-out.</w:t>
             </w:r>
           </w:p>
         </w:tc>
@@ -2319,7 +2737,7 @@
           </w:tcPr>
           <w:p>
             <w:r>
-              <w:t>pytest (24 tests)</w:t>
+              <w:t>pytest (35 tests)</w:t>
             </w:r>
           </w:p>
         </w:tc>
@@ -2350,7 +2768,7 @@
         <w:pStyle w:val="ListBullet"/>
       </w:pPr>
       <w:r>
-        <w:t>6,362,604 / 6,362,604 rows populated with anomaly_score/is_anomaly -- zero NULLs.</w:t>
+        <w:t>6,362,604 / 6,362,604 rows populated with anomaly_score/is_anomaly -- zero NULLs (scored with the run 1 model).</w:t>
       </w:r>
     </w:p>
     <w:p>
@@ -2358,7 +2776,7 @@
         <w:pStyle w:val="ListBullet"/>
       </w:pPr>
       <w:r>
-        <w:t>model_runs: 1 row, is_deployed = 1, PR-AUC/ROC-AUC/precision@k/recall@k all populated.</w:t>
+        <w:t>model_runs: 2 rows; run 2 (train_step_end = 355) is deployed, with held-out and training-window metrics populated.</w:t>
       </w:r>
     </w:p>
     <w:p>
@@ -2366,7 +2784,7 @@
         <w:pStyle w:val="ListBullet"/>
       </w:pPr>
       <w:r>
-        <w:t>drift_metrics: 12 rows (one per model feature) for the evaluated run.</w:t>
+        <w:t>drift_metrics: 12 rows (one per model feature) for each of runs 1 and 2.</w:t>
       </w:r>
     </w:p>
     <w:p>
@@ -2374,7 +2792,7 @@
         <w:pStyle w:val="ListBullet"/>
       </w:pPr>
       <w:r>
-        <w:t>retrain_log: 1 row, correctly logging no trigger on the reference-window comparison.</w:t>
+        <w:t>retrain_log: 2 rows, each correctly logging no trigger.</w:t>
       </w:r>
     </w:p>
     <w:p>
@@ -2382,7 +2800,7 @@
         <w:pStyle w:val="ListBullet"/>
       </w:pPr>
       <w:r>
-        <w:t>pytest: 24/24 passing.</w:t>
+        <w:t>pytest: 35/35 passing.</w:t>
       </w:r>
     </w:p>
     <w:p>

</xml_diff>